<commit_message>
Fix handling of table cell borders with grid gaps
- Updated the logic in `resolve_table_cell_borders` to correctly identify when a cell is the first or last in its row, accounting for gaps.
- Enhanced the `resolve_cell_effective_borders` function to ensure that edges facing gaps do not receive table-level borders.
- Added tests to verify that gaps at both ends of a row do not paint borders and that interior boundaries within gapped rows are still rendered.
- Adjusted the fixture to reflect changes in border rendering behavior, ensuring consistency with Word's rendering.
</commit_message>
<xml_diff>
--- a/test-files/grid-gap-borders.docx
+++ b/test-files/grid-gap-borders.docx
@@ -116,6 +116,33 @@
           <w:p>
             <w:r>
               <w:t xml:space="preserve">F</w:t>
+            </w:r>
+          </w:p>
+        </w:tc>
+      </w:tr>
+      <w:tr>
+        <w:trPr>
+          <w:gridBefore w:val="1"/>
+        </w:trPr>
+        <w:tc>
+          <w:tcPr>
+            <w:tcW w:w="0" w:type="auto"/>
+            <w:shd w:val="clear" w:color="auto" w:fill="D9EAD3"/>
+          </w:tcPr>
+          <w:p>
+            <w:r>
+              <w:t xml:space="preserve">G</w:t>
+            </w:r>
+          </w:p>
+        </w:tc>
+        <w:tc>
+          <w:tcPr>
+            <w:tcW w:w="0" w:type="auto"/>
+            <w:shd w:val="clear" w:color="auto" w:fill="CFE2F3"/>
+          </w:tcPr>
+          <w:p>
+            <w:r>
+              <w:t xml:space="preserve">H</w:t>
             </w:r>
           </w:p>
         </w:tc>
@@ -249,6 +276,33 @@
           </w:p>
         </w:tc>
       </w:tr>
+      <w:tr>
+        <w:trPr>
+          <w:gridBefore w:val="1"/>
+        </w:trPr>
+        <w:tc>
+          <w:tcPr>
+            <w:tcW w:w="0" w:type="auto"/>
+            <w:shd w:val="clear" w:color="auto" w:fill="D9EAD3"/>
+          </w:tcPr>
+          <w:p>
+            <w:r>
+              <w:t xml:space="preserve">G</w:t>
+            </w:r>
+          </w:p>
+        </w:tc>
+        <w:tc>
+          <w:tcPr>
+            <w:tcW w:w="0" w:type="auto"/>
+            <w:shd w:val="clear" w:color="auto" w:fill="CFE2F3"/>
+          </w:tcPr>
+          <w:p>
+            <w:r>
+              <w:t xml:space="preserve">H</w:t>
+            </w:r>
+          </w:p>
+        </w:tc>
+      </w:tr>
     </w:tbl>
     <w:p/>
     <w:p>

</xml_diff>